<commit_message>
docs: align final report with measured evidence and document execution modes
- replace fabricated per-scenario durations with the six measured
  detection-to-dispatch intervals (3.23-6.80 s, mean 4.40 s)
- reframe MTTR as detection-to-dispatch, soften sub-6 s claims, and add
  the time-to-healthy caveat
- correct the RDS description to an attempted ForceFailover with an
  observed single-AZ fallback reboot
- describe storage remediation as read-only SSM diagnostics
- reconcile the cost estimate to ~$44-56/month and remove the
  "100% absorbed" claim
- add a Known Limitations section covering health verification, alarm
  coverage, out-of-band fleet provisioning, composite health scoring,
  and single-region scale
- update INCIDENT_LIFECYCLE and VIVA_PREPARATION to describe the
  SIMULATION default and opt-in HYBRID/REAL_AWS modes
- annotate the dated v1 architecture audit
</commit_message>
<xml_diff>
--- a/CloudPulse_Final_Review_Report.docx
+++ b/CloudPulse_Final_Review_Report.docx
@@ -199,7 +199,7 @@
           <w:color w:val="1F2937"/>
           <w:sz w:val="18"/>
         </w:rPr>
-        <w:t>Crucially, while CloudPulse v1 operated as a safe simulated digital twin, CloudPulse v2 introduces a Hybrid Execution Engine operating directly against genuine, billable AWS infrastructure services, including real EC2 instances (t3.micro running Amazon Linux 2023), live Auto Scaling Groups (asg-cloudpulse-fleet), dual-target Application Load Balancers (alb-cloudpulse-gw), Amazon RDS PostgreSQL databases (rds-cloudpulse-db), and AWS Systems Manager (SSM) agent run-commands. CloudPulse enforces strict Zero-Destruction Safety Governance through cryptographic resource allowlisting (REAL_AWS_ALLOWLIST) and non-destructive diagnostic execution. Across 422 automated tests (373 backend integration/unit tests and 49 frontend Vitest suites) and live AWS chaos injections, CloudPulse achieves a 100% test pass rate, 0 unhandled dead-letter queue failures, and reduces incident MTTR from 45 minutes to under 5.8 seconds—an 87.1% reduction in downtime—while maintaining an operational cost fully absorbed within standard student AWS credit allocations (~$35–$45/month).</w:t>
+        <w:t>Crucially, while CloudPulse v1 operated as a safe simulated digital twin, CloudPulse v2 introduces a Hybrid Execution Engine operating directly against genuine, billable AWS infrastructure services, including real EC2 instances (t3.micro running Amazon Linux 2023), live Auto Scaling Groups (asg-cloudpulse-fleet), dual-target Application Load Balancers (alb-cloudpulse-gw), Amazon RDS PostgreSQL databases (rds-cloudpulse-db), and AWS Systems Manager (SSM) agent run-commands. CloudPulse enforces strict Zero-Destruction Safety Governance through cryptographic resource allowlisting (REAL_AWS_ALLOWLIST) and non-destructive diagnostic execution. Across 422 automated tests (373 backend integration/unit tests and 49 frontend Vitest suites) and live AWS chaos injections, CloudPulse achieves a 100% test pass rate and no dead-letter queue failures in the exercised scenarios, and reduces the detection-to-dispatch interval from a 45-minute manual baseline to a measured 3.2–6.8 seconds (mean 4.40 s), an over-99% reduction in that interval. The estimated operational cost is roughly $44–$56 per month at list prices, though actual spend depends on Free Tier eligibility and credits.</w:t>
       </w:r>
     </w:p>
     <w:tbl>
@@ -251,7 +251,7 @@
                 <w:color w:val="1E293B"/>
                 <w:sz w:val="17"/>
               </w:rPr>
-              <w:t>CloudPulse v2 transitions autonomous cloud reliability from simulated digital-twin concepts to live commercial cloud operations. Deployed in AWS Region ap-south-1 (Mumbai), CloudPulse v2 monitors and heals real EC2 instances, Auto Scaling Groups, Application Load Balancers, and Amazon RDS PostgreSQL databases with sub-5.8s MTTR.</w:t>
+              <w:t>CloudPulse v2 transitions autonomous cloud reliability from simulated digital-twin concepts to live commercial cloud operations. Deployed in AWS Region ap-south-1 (Mumbai), CloudPulse v2 monitors and heals real EC2 instances, Auto Scaling Groups, Application Load Balancers, and Amazon RDS PostgreSQL databases; the six exercised real remediations recorded a measured 3.2–6.8 s time-to-dispatch.</w:t>
             </w:r>
           </w:p>
         </w:tc>
@@ -2734,7 +2734,7 @@
                 <w:color w:val="1F2937"/>
                 <w:sz w:val="14"/>
               </w:rPr>
-              <w:t>Performance Benchmarking &amp; MTTR Reduction Analysis</w:t>
+              <w:t>Performance Benchmarking &amp; Detection-to-Dispatch Analysis</w:t>
             </w:r>
           </w:p>
         </w:tc>
@@ -2955,7 +2955,7 @@
                 <w:color w:val="1F2937"/>
                 <w:sz w:val="14"/>
               </w:rPr>
-              <w:t>6.0</w:t>
+              <w:t xml:space="preserve">  5.6</w:t>
             </w:r>
           </w:p>
         </w:tc>
@@ -2963,6 +2963,88 @@
           <w:tcPr>
             <w:tcW w:type="dxa" w:w="7344"/>
             <w:shd w:fill="F8FAFC"/>
+            <w:tcMar>
+              <w:top w:w="12" w:type="dxa"/>
+              <w:bottom w:w="12" w:type="dxa"/>
+              <w:left w:w="35" w:type="dxa"/>
+              <w:right w:w="35" w:type="dxa"/>
+            </w:tcMar>
+          </w:tcPr>
+          <w:p>
+            <w:pPr>
+              <w:spacing w:before="0" w:after="0" w:line="240" w:lineRule="auto"/>
+            </w:pPr>
+            <w:r>
+              <w:rPr>
+                <w:rFonts w:ascii="Tahoma" w:hAnsi="Tahoma"/>
+                <w:color w:val="1F2937"/>
+                <w:sz w:val="14"/>
+              </w:rPr>
+              <w:t>Known Limitations &amp; Engineering Trade-offs</w:t>
+            </w:r>
+          </w:p>
+        </w:tc>
+        <w:tc>
+          <w:tcPr>
+            <w:tcW w:type="dxa" w:w="1008"/>
+            <w:shd w:fill="F8FAFC"/>
+            <w:tcMar>
+              <w:top w:w="12" w:type="dxa"/>
+              <w:bottom w:w="12" w:type="dxa"/>
+              <w:left w:w="35" w:type="dxa"/>
+              <w:right w:w="35" w:type="dxa"/>
+            </w:tcMar>
+          </w:tcPr>
+          <w:p>
+            <w:pPr>
+              <w:spacing w:before="0" w:after="0" w:line="240" w:lineRule="auto"/>
+              <w:jc w:val="right"/>
+            </w:pPr>
+            <w:r>
+              <w:rPr>
+                <w:rFonts w:ascii="Tahoma" w:hAnsi="Tahoma"/>
+                <w:color w:val="1F2937"/>
+                <w:sz w:val="14"/>
+              </w:rPr>
+              <w:t>28</w:t>
+            </w:r>
+          </w:p>
+        </w:tc>
+      </w:tr>
+      <w:tr>
+        <w:trPr>
+          <w:cantSplit/>
+        </w:trPr>
+        <w:tc>
+          <w:tcPr>
+            <w:tcW w:type="dxa" w:w="1440"/>
+            <w:shd w:fill="FFFFFF"/>
+            <w:tcMar>
+              <w:top w:w="12" w:type="dxa"/>
+              <w:bottom w:w="12" w:type="dxa"/>
+              <w:left w:w="35" w:type="dxa"/>
+              <w:right w:w="35" w:type="dxa"/>
+            </w:tcMar>
+          </w:tcPr>
+          <w:p>
+            <w:pPr>
+              <w:spacing w:before="0" w:after="0" w:line="240" w:lineRule="auto"/>
+              <w:jc w:val="left"/>
+            </w:pPr>
+            <w:r>
+              <w:rPr>
+                <w:rFonts w:ascii="Tahoma" w:hAnsi="Tahoma"/>
+                <w:color w:val="1F2937"/>
+                <w:sz w:val="14"/>
+              </w:rPr>
+              <w:t>6.0</w:t>
+            </w:r>
+          </w:p>
+        </w:tc>
+        <w:tc>
+          <w:tcPr>
+            <w:tcW w:type="dxa" w:w="7344"/>
+            <w:shd w:fill="FFFFFF"/>
             <w:tcMar>
               <w:top w:w="12" w:type="dxa"/>
               <w:bottom w:w="12" w:type="dxa"/>
@@ -2987,7 +3069,7 @@
         <w:tc>
           <w:tcPr>
             <w:tcW w:type="dxa" w:w="1008"/>
-            <w:shd w:fill="F8FAFC"/>
+            <w:shd w:fill="FFFFFF"/>
             <w:tcMar>
               <w:top w:w="12" w:type="dxa"/>
               <w:bottom w:w="12" w:type="dxa"/>
@@ -3006,7 +3088,7 @@
                 <w:color w:val="1F2937"/>
                 <w:sz w:val="14"/>
               </w:rPr>
-              <w:t>28</w:t>
+              <w:t>29</w:t>
             </w:r>
           </w:p>
         </w:tc>
@@ -3018,7 +3100,7 @@
         <w:tc>
           <w:tcPr>
             <w:tcW w:type="dxa" w:w="1440"/>
-            <w:shd w:fill="FFFFFF"/>
+            <w:shd w:fill="F8FAFC"/>
             <w:tcMar>
               <w:top w:w="12" w:type="dxa"/>
               <w:bottom w:w="12" w:type="dxa"/>
@@ -3044,7 +3126,7 @@
         <w:tc>
           <w:tcPr>
             <w:tcW w:type="dxa" w:w="7344"/>
-            <w:shd w:fill="FFFFFF"/>
+            <w:shd w:fill="F8FAFC"/>
             <w:tcMar>
               <w:top w:w="12" w:type="dxa"/>
               <w:bottom w:w="12" w:type="dxa"/>
@@ -3069,7 +3151,7 @@
         <w:tc>
           <w:tcPr>
             <w:tcW w:type="dxa" w:w="1008"/>
-            <w:shd w:fill="FFFFFF"/>
+            <w:shd w:fill="F8FAFC"/>
             <w:tcMar>
               <w:top w:w="12" w:type="dxa"/>
               <w:bottom w:w="12" w:type="dxa"/>
@@ -3088,7 +3170,7 @@
                 <w:color w:val="1F2937"/>
                 <w:sz w:val="14"/>
               </w:rPr>
-              <w:t>28</w:t>
+              <w:t>29</w:t>
             </w:r>
           </w:p>
         </w:tc>
@@ -3100,7 +3182,7 @@
         <w:tc>
           <w:tcPr>
             <w:tcW w:type="dxa" w:w="1440"/>
-            <w:shd w:fill="F8FAFC"/>
+            <w:shd w:fill="FFFFFF"/>
             <w:tcMar>
               <w:top w:w="12" w:type="dxa"/>
               <w:bottom w:w="12" w:type="dxa"/>
@@ -3126,7 +3208,7 @@
         <w:tc>
           <w:tcPr>
             <w:tcW w:type="dxa" w:w="7344"/>
-            <w:shd w:fill="F8FAFC"/>
+            <w:shd w:fill="FFFFFF"/>
             <w:tcMar>
               <w:top w:w="12" w:type="dxa"/>
               <w:bottom w:w="12" w:type="dxa"/>
@@ -3151,7 +3233,7 @@
         <w:tc>
           <w:tcPr>
             <w:tcW w:type="dxa" w:w="1008"/>
-            <w:shd w:fill="F8FAFC"/>
+            <w:shd w:fill="FFFFFF"/>
             <w:tcMar>
               <w:top w:w="12" w:type="dxa"/>
               <w:bottom w:w="12" w:type="dxa"/>
@@ -3170,7 +3252,7 @@
                 <w:color w:val="1F2937"/>
                 <w:sz w:val="14"/>
               </w:rPr>
-              <w:t>28</w:t>
+              <w:t>29</w:t>
             </w:r>
           </w:p>
         </w:tc>
@@ -3182,7 +3264,7 @@
         <w:tc>
           <w:tcPr>
             <w:tcW w:type="dxa" w:w="1440"/>
-            <w:shd w:fill="FFFFFF"/>
+            <w:shd w:fill="F8FAFC"/>
             <w:tcMar>
               <w:top w:w="12" w:type="dxa"/>
               <w:bottom w:w="12" w:type="dxa"/>
@@ -3208,7 +3290,7 @@
         <w:tc>
           <w:tcPr>
             <w:tcW w:type="dxa" w:w="7344"/>
-            <w:shd w:fill="FFFFFF"/>
+            <w:shd w:fill="F8FAFC"/>
             <w:tcMar>
               <w:top w:w="12" w:type="dxa"/>
               <w:bottom w:w="12" w:type="dxa"/>
@@ -3233,7 +3315,7 @@
         <w:tc>
           <w:tcPr>
             <w:tcW w:type="dxa" w:w="1008"/>
-            <w:shd w:fill="FFFFFF"/>
+            <w:shd w:fill="F8FAFC"/>
             <w:tcMar>
               <w:top w:w="12" w:type="dxa"/>
               <w:bottom w:w="12" w:type="dxa"/>
@@ -3252,7 +3334,7 @@
                 <w:color w:val="1F2937"/>
                 <w:sz w:val="14"/>
               </w:rPr>
-              <w:t>29</w:t>
+              <w:t>30</w:t>
             </w:r>
           </w:p>
         </w:tc>
@@ -3264,7 +3346,7 @@
         <w:tc>
           <w:tcPr>
             <w:tcW w:type="dxa" w:w="1440"/>
-            <w:shd w:fill="F8FAFC"/>
+            <w:shd w:fill="FFFFFF"/>
             <w:tcMar>
               <w:top w:w="12" w:type="dxa"/>
               <w:bottom w:w="12" w:type="dxa"/>
@@ -3290,7 +3372,7 @@
         <w:tc>
           <w:tcPr>
             <w:tcW w:type="dxa" w:w="7344"/>
-            <w:shd w:fill="F8FAFC"/>
+            <w:shd w:fill="FFFFFF"/>
             <w:tcMar>
               <w:top w:w="12" w:type="dxa"/>
               <w:bottom w:w="12" w:type="dxa"/>
@@ -3315,7 +3397,7 @@
         <w:tc>
           <w:tcPr>
             <w:tcW w:type="dxa" w:w="1008"/>
-            <w:shd w:fill="F8FAFC"/>
+            <w:shd w:fill="FFFFFF"/>
             <w:tcMar>
               <w:top w:w="12" w:type="dxa"/>
               <w:bottom w:w="12" w:type="dxa"/>
@@ -3334,7 +3416,7 @@
                 <w:color w:val="1F2937"/>
                 <w:sz w:val="14"/>
               </w:rPr>
-              <w:t>29</w:t>
+              <w:t>30</w:t>
             </w:r>
           </w:p>
         </w:tc>
@@ -3346,7 +3428,7 @@
         <w:tc>
           <w:tcPr>
             <w:tcW w:type="dxa" w:w="1440"/>
-            <w:shd w:fill="FFFFFF"/>
+            <w:shd w:fill="F8FAFC"/>
             <w:tcMar>
               <w:top w:w="12" w:type="dxa"/>
               <w:bottom w:w="12" w:type="dxa"/>
@@ -3372,7 +3454,7 @@
         <w:tc>
           <w:tcPr>
             <w:tcW w:type="dxa" w:w="7344"/>
-            <w:shd w:fill="FFFFFF"/>
+            <w:shd w:fill="F8FAFC"/>
             <w:tcMar>
               <w:top w:w="12" w:type="dxa"/>
               <w:bottom w:w="12" w:type="dxa"/>
@@ -3397,7 +3479,7 @@
         <w:tc>
           <w:tcPr>
             <w:tcW w:type="dxa" w:w="1008"/>
-            <w:shd w:fill="FFFFFF"/>
+            <w:shd w:fill="F8FAFC"/>
             <w:tcMar>
               <w:top w:w="12" w:type="dxa"/>
               <w:bottom w:w="12" w:type="dxa"/>
@@ -3416,7 +3498,7 @@
                 <w:color w:val="1F2937"/>
                 <w:sz w:val="14"/>
               </w:rPr>
-              <w:t>30</w:t>
+              <w:t>31</w:t>
             </w:r>
           </w:p>
         </w:tc>
@@ -5491,7 +5573,7 @@
           <w:color w:val="1F2937"/>
           <w:sz w:val="17"/>
         </w:rPr>
-        <w:t>Empirically validate system resilience through 422 automated tests and live chaos injections, proving sub-6-second MTTR.</w:t>
+        <w:t>Empirically validate system resilience through 422 automated tests and live chaos injections, recording a measured 3.2–6.8 s time-to-dispatch across the exercised AWS actions.</w:t>
       </w:r>
     </w:p>
     <w:p>
@@ -5924,7 +6006,7 @@
           <w:color w:val="1F2937"/>
           <w:sz w:val="18"/>
         </w:rPr>
-        <w:t>The authors focus predominantly on telemetry ingestion pipelines and omit concrete self-healing actuation. CloudPulse incorporates the transient storage exhaustion and network latency scenarios identified by Cassel et al., providing automated SSM disk cleanup and ALB traffic rerouting strategies.</w:t>
+        <w:t>The authors focus predominantly on telemetry ingestion pipelines and omit concrete self-healing actuation. CloudPulse incorporates the transient storage exhaustion and network latency scenarios identified by Cassel et al., providing automated read-only SSM storage diagnostics and ALB traffic rerouting strategies.</w:t>
       </w:r>
     </w:p>
     <w:p>
@@ -7985,7 +8067,7 @@
                 <w:color w:val="1F2937"/>
                 <w:sz w:val="15"/>
               </w:rPr>
-              <w:t>89.3% MTTR Drop (&lt;5.8s)</w:t>
+              <w:t>Time-to-dispatch 3.2–6.8 s</w:t>
             </w:r>
           </w:p>
         </w:tc>
@@ -8855,7 +8937,7 @@
               <w:spacing w:before="0" w:after="0" w:line="240" w:lineRule="auto"/>
             </w:pPr>
             <w:r>
-              <w:t>Simulated disk space cleanup log</w:t>
+              <w:t>Simulated storage diagnostics log</w:t>
             </w:r>
           </w:p>
         </w:tc>
@@ -13077,6 +13159,28 @@
     </w:p>
     <w:p>
       <w:pPr>
+        <w:spacing w:before="0" w:after="56" w:line="269" w:lineRule="auto"/>
+      </w:pPr>
+      <w:r>
+        <w:rPr>
+          <w:rFonts w:ascii="Tahoma" w:hAnsi="Tahoma"/>
+          <w:b/>
+          <w:color w:val="1F2937"/>
+          <w:sz w:val="18"/>
+        </w:rPr>
+        <w:t xml:space="preserve">Deployed behaviour: </w:t>
+      </w:r>
+      <w:r>
+        <w:rPr>
+          <w:rFonts w:ascii="Tahoma" w:hAnsi="Tahoma"/>
+          <w:color w:val="1F2937"/>
+          <w:sz w:val="18"/>
+        </w:rPr>
+        <w:t>The development database is single-AZ, so ForceFailover raised a ClientError during the live run and the strategy fell through to a plain reboot_db_instance call. The incident record therefore reports a successful reboot rather than a Multi-AZ failover, and Chapter 5 labels the action accordingly.</w:t>
+      </w:r>
+    </w:p>
+    <w:p>
+      <w:pPr>
         <w:keepNext/>
         <w:spacing w:before="140" w:after="40"/>
       </w:pPr>
@@ -14547,7 +14651,7 @@
               <w:br/>
               <w:t xml:space="preserve">  -&gt; stdout: 'Filesystem Size Used Avail Use% Mounted on /dev/nvme0n1p1 8.0G 1.6G 6.4G 20% /tmp 0 /var/log 8.7M'</w:t>
               <w:br/>
-              <w:t>Result: Storage diagnostic executed remotely on live EC2 worker | State: RECOVERED | Duration: 4.12s</w:t>
+              <w:t>Result: Storage diagnostic executed remotely on live EC2 worker | State: RECOVERED | Duration: 3.29s</w:t>
               <w:br/>
               <w:br/>
               <w:t>[SCENARIO 4: FS-04 NETWORK LATENCY -&gt; ALB TRAFFIC REROUTE]</w:t>
@@ -14558,18 +14662,20 @@
               <w:br/>
               <w:t>AWS Verification: aws elbv2 describe-listeners --load-balancer-arn arn:aws:elasticloadbalancing:...:alb-cloudpulse-gw</w:t>
               <w:br/>
-              <w:t xml:space="preserve">  -&gt; DefaultActions[0].TargetGroupArn: '...:targetgroup/tg-cloudpulse-standby/f5bad312b59f20ba' | Duration: 2.15s</w:t>
+              <w:t xml:space="preserve">  -&gt; DefaultActions[0].TargetGroupArn: '...:targetgroup/tg-cloudpulse-standby/f5bad312b59f20ba' | Duration: 3.23s</w:t>
+              <w:br/>
+              <w:t>Post-run: listener restored to tg-cloudpulse-primary via scripts/restore_demo_alb.sh; ALB returns HTTP 200.</w:t>
               <w:br/>
               <w:br/>
-              <w:t>[SCENARIO 5: FS-05 SERVICE DOWNTIME -&gt; RDS POSTGRESQL REBOOT/FAILOVER]</w:t>
+              <w:t>[SCENARIO 5: FS-05 SERVICE DOWNTIME -&gt; RDS FAILOVER ATTEMPT / FALLBACK REBOOT]</w:t>
               <w:br/>
               <w:t>Fault Injected: POST /simulate/failure {'resourceId': 'RDS-CLOUDPULSE-DB', 'failureType': 'SERVICE_DOWNTIME'}</w:t>
               <w:br/>
-              <w:t>boto3 Actuation: rds.reboot_db_instance(DBInstanceIdentifier='rds-cloudpulse-db')</w:t>
+              <w:t>boto3 Actuation: rds.reboot_db_instance(..., ForceFailover=True) -&gt; ClientError -&gt; reboot_db_instance(...)</w:t>
               <w:br/>
               <w:t>AWS Verification: aws rds describe-db-instances --db-instance-identifier rds-cloudpulse-db</w:t>
               <w:br/>
-              <w:t xml:space="preserve">  -&gt; DBInstanceStatus: 'rebooting' (Port 5432 PostgreSQL 16 cluster) | State: RECOVERED | Duration: 6.40s</w:t>
+              <w:t xml:space="preserve">  -&gt; DBInstanceStatus: 'rebooting' (Port 5432 PostgreSQL 16 cluster) | State: RECOVERED | Duration: 3.69s</w:t>
             </w:r>
           </w:p>
         </w:tc>
@@ -14579,6 +14685,28 @@
       <w:pPr>
         <w:spacing w:after="40"/>
       </w:pPr>
+    </w:p>
+    <w:p>
+      <w:pPr>
+        <w:spacing w:before="0" w:after="56" w:line="269" w:lineRule="auto"/>
+      </w:pPr>
+      <w:r>
+        <w:rPr>
+          <w:rFonts w:ascii="Tahoma" w:hAnsi="Tahoma"/>
+          <w:b/>
+          <w:color w:val="1F2937"/>
+          <w:sz w:val="18"/>
+        </w:rPr>
+        <w:t xml:space="preserve">Measured evidence: </w:t>
+      </w:r>
+      <w:r>
+        <w:rPr>
+          <w:rFonts w:ascii="Tahoma" w:hAnsi="Tahoma"/>
+          <w:color w:val="1F2937"/>
+          <w:sz w:val="18"/>
+        </w:rPr>
+        <w:t>Six real remediations were recorded in DynamoDB on 24 October 2026: EC2 RebootInstances twice (6.80 s and 3.52 s), ASG scale-out 1 to 2 (5.87 s), SSM SendCommand Success (3.29 s), ALB listener reroute (3.23 s), and the RDS fallback reboot (3.69 s). Each duration is detected_at to resolved_at, i.e. the time until the remediation is dispatched and the incident is closed, not the time until the workload is fully healthy again.</w:t>
+      </w:r>
     </w:p>
     <w:p>
       <w:pPr>
@@ -14592,7 +14720,7 @@
           <w:color w:val="2563EB"/>
           <w:sz w:val="21"/>
         </w:rPr>
-        <w:t>5.3 Performance Benchmarking &amp; MTTR Reduction Analysis</w:t>
+        <w:t>5.3 Performance Benchmarking &amp; Detection-to-Dispatch Analysis</w:t>
       </w:r>
     </w:p>
     <w:p>
@@ -15345,7 +15473,7 @@
               <w:jc w:val="left"/>
             </w:pPr>
             <w:r>
-              <w:t>Overall Total MTTR</w:t>
+              <w:t>Overall Detection-to-Dispatch</w:t>
             </w:r>
           </w:p>
         </w:tc>
@@ -15405,7 +15533,7 @@
               <w:spacing w:before="0" w:after="0" w:line="240" w:lineRule="auto"/>
             </w:pPr>
             <w:r>
-              <w:t>3.5 – 6.4 seconds (Avg: 4.8 sec)</w:t>
+              <w:t>3.2 – 6.8 seconds (mean 4.40 s, median 3.61 s)</w:t>
             </w:r>
           </w:p>
         </w:tc>
@@ -15430,7 +15558,7 @@
                 <w:color w:val="1F2937"/>
                 <w:sz w:val="15"/>
               </w:rPr>
-              <w:t>89.3% Reduction</w:t>
+              <w:t>≈99.0% vs. scripted</w:t>
             </w:r>
           </w:p>
         </w:tc>
@@ -15490,7 +15618,7 @@
                 <w:color w:val="1E293B"/>
                 <w:sz w:val="17"/>
               </w:rPr>
-              <w:t>Empirical Benchmark Finding: CloudPulse v2 achieves an average closed-loop MTTR of 4.8 seconds across all 5 failure scenarios, representing an 89.3% reduction compared to semi-automated scripting and over 99.7% reduction compared to human on-call incident response, completely eliminating human operational latency.</w:t>
+              <w:t>Measured Benchmark Finding: across the six exercised real remediations, the detection-to-dispatch interval ranged from 3.23 s to 6.80 s (mean 4.40 s, median 3.61 s). That is about 99.0% faster than the semi-automated scripting baseline and 99.8% faster than manual on-call handling. The measurement stops when the SDK action is dispatched and the incident is closed; it does not include instance boot, database availability, or target-group health convergence, which can take tens of seconds to minutes.</w:t>
             </w:r>
           </w:p>
         </w:tc>
@@ -15554,7 +15682,7 @@
           <w:color w:val="1F2937"/>
           <w:sz w:val="18"/>
         </w:rPr>
-        <w:t>Table 5.3 provides a detailed operational cost breakdown confirming that the running fleet is 100% absorbed within credits:</w:t>
+        <w:t>Table 5.3 gives a list-price estimate for continuous operation. These are planning figures, not billing data; actual spend depends on ASG scaling, data transfer, and whether the account still has Free Tier eligibility:</w:t>
       </w:r>
     </w:p>
     <w:tbl>
@@ -15981,7 +16109,7 @@
               <w:spacing w:before="0" w:after="0" w:line="240" w:lineRule="auto"/>
             </w:pPr>
             <w:r>
-              <w:t>$0.0225 / hr + $0.008 / LCU</w:t>
+              <w:t>$0.0225 / hr + $0.008 / LCU-hr</w:t>
             </w:r>
           </w:p>
         </w:tc>
@@ -16001,7 +16129,7 @@
               <w:spacing w:before="0" w:after="0" w:line="240" w:lineRule="auto"/>
             </w:pPr>
             <w:r>
-              <w:t>720 hours + 1.2 LCUs</w:t>
+              <w:t>720 hours + 1.2 LCU-hr</w:t>
             </w:r>
           </w:p>
         </w:tc>
@@ -16021,7 +16149,7 @@
               <w:spacing w:before="0" w:after="0" w:line="240" w:lineRule="auto"/>
             </w:pPr>
             <w:r>
-              <w:t>$17.10</w:t>
+              <w:t>$23.11</w:t>
             </w:r>
           </w:p>
         </w:tc>
@@ -16798,7 +16926,7 @@
               <w:spacing w:before="0" w:after="0" w:line="240" w:lineRule="auto"/>
             </w:pPr>
             <w:r>
-              <w:t>~$35 – $43 / mo</w:t>
+              <w:t>≈ $44 – $56 / mo</w:t>
             </w:r>
           </w:p>
         </w:tc>
@@ -16823,7 +16951,7 @@
                 <w:color w:val="1F2937"/>
                 <w:sz w:val="15"/>
               </w:rPr>
-              <w:t>Fully Covered (~2.5 months runway)</w:t>
+              <w:t>Estimate; credits/Free Tier vary</w:t>
             </w:r>
           </w:p>
         </w:tc>
@@ -16833,6 +16961,118 @@
       <w:pPr>
         <w:spacing w:after="40"/>
       </w:pPr>
+    </w:p>
+    <w:p>
+      <w:pPr>
+        <w:keepNext/>
+        <w:spacing w:before="140" w:after="40"/>
+      </w:pPr>
+      <w:r>
+        <w:rPr>
+          <w:rFonts w:ascii="Tahoma" w:hAnsi="Tahoma"/>
+          <w:b/>
+          <w:color w:val="2563EB"/>
+          <w:sz w:val="21"/>
+        </w:rPr>
+        <w:t>5.6 Known Limitations &amp; Engineering Trade-offs</w:t>
+      </w:r>
+    </w:p>
+    <w:p>
+      <w:pPr>
+        <w:spacing w:before="0" w:after="56" w:line="269" w:lineRule="auto"/>
+      </w:pPr>
+      <w:r>
+        <w:rPr>
+          <w:rFonts w:ascii="Tahoma" w:hAnsi="Tahoma"/>
+          <w:color w:val="1F2937"/>
+          <w:sz w:val="18"/>
+        </w:rPr>
+        <w:t>The delivered system is explicit about what it does and does not measure. The following are deliberate scope decisions for a course-scale deployment:</w:t>
+      </w:r>
+    </w:p>
+    <w:p>
+      <w:pPr>
+        <w:pStyle w:val="ListBullet"/>
+        <w:spacing w:before="0" w:after="36" w:line="269" w:lineRule="auto"/>
+      </w:pPr>
+      <w:r>
+        <w:rPr>
+          <w:rFonts w:ascii="Tahoma" w:hAnsi="Tahoma"/>
+          <w:color w:val="1F2937"/>
+          <w:sz w:val="17"/>
+        </w:rPr>
+        <w:t>Time-to-dispatch, not time-to-healthy: the 3.2–6.8 s figures cover detection, gating, SDK dispatch, and incident closure. No post-action health predicate runs inside the recovery path, so EC2 boot, RDS availability, and ALB target-group convergence are not included.</w:t>
+      </w:r>
+    </w:p>
+    <w:p>
+      <w:pPr>
+        <w:pStyle w:val="ListBullet"/>
+        <w:spacing w:before="0" w:after="36" w:line="269" w:lineRule="auto"/>
+      </w:pPr>
+      <w:r>
+        <w:rPr>
+          <w:rFonts w:ascii="Tahoma" w:hAnsi="Tahoma"/>
+          <w:color w:val="1F2937"/>
+          <w:sz w:val="17"/>
+        </w:rPr>
+        <w:t>Alarm coverage is virtual-resource only: the 12 CloudWatch alarms in infrastructure/template.yaml cover the four simulated resources. The real EC2/ASG/ALB/RDS fleet is exercised through the /simulate/failure endpoint and direct CLI runs rather than through those alarms.</w:t>
+      </w:r>
+    </w:p>
+    <w:p>
+      <w:pPr>
+        <w:pStyle w:val="ListBullet"/>
+        <w:spacing w:before="0" w:after="36" w:line="269" w:lineRule="auto"/>
+      </w:pPr>
+      <w:r>
+        <w:rPr>
+          <w:rFonts w:ascii="Tahoma" w:hAnsi="Tahoma"/>
+          <w:color w:val="1F2937"/>
+          <w:sz w:val="17"/>
+        </w:rPr>
+        <w:t>The real fleet is provisioned out-of-band: sam deploy creates the serverless control plane and the virtual resources. The EC2 instance, Auto Scaling Group, ALB, and RDS instance were created with scripts/manage_real_aws.py and the AWS CLI, so a clean SAM deployment alone does not recreate them.</w:t>
+      </w:r>
+    </w:p>
+    <w:p>
+      <w:pPr>
+        <w:pStyle w:val="ListBullet"/>
+        <w:spacing w:before="0" w:after="36" w:line="269" w:lineRule="auto"/>
+      </w:pPr>
+      <w:r>
+        <w:rPr>
+          <w:rFonts w:ascii="Tahoma" w:hAnsi="Tahoma"/>
+          <w:color w:val="1F2937"/>
+          <w:sz w:val="17"/>
+        </w:rPr>
+        <w:t>Composite health scoring has blind spots: ServiceHealth is a weighted aggregate, and a single-resource total outage scores around 72.8, which is not low enough to trip the composite alarm on its own. Detection therefore relies mainly on the per-metric CPU, latency, and service alarms.</w:t>
+      </w:r>
+    </w:p>
+    <w:p>
+      <w:pPr>
+        <w:pStyle w:val="ListBullet"/>
+        <w:spacing w:before="0" w:after="36" w:line="269" w:lineRule="auto"/>
+      </w:pPr>
+      <w:r>
+        <w:rPr>
+          <w:rFonts w:ascii="Tahoma" w:hAnsi="Tahoma"/>
+          <w:color w:val="1F2937"/>
+          <w:sz w:val="17"/>
+        </w:rPr>
+        <w:t>Single-region, four-resource scale: the allowlist contains 8 IDs covering 4 resources in ap-south-1. The design has not been validated across regions, larger fleets, or concurrent multi-resource incidents.</w:t>
+      </w:r>
+    </w:p>
+    <w:p>
+      <w:pPr>
+        <w:pStyle w:val="ListBullet"/>
+        <w:spacing w:before="0" w:after="36" w:line="269" w:lineRule="auto"/>
+      </w:pPr>
+      <w:r>
+        <w:rPr>
+          <w:rFonts w:ascii="Tahoma" w:hAnsi="Tahoma"/>
+          <w:color w:val="1F2937"/>
+          <w:sz w:val="17"/>
+        </w:rPr>
+        <w:t>Safe-by-default execution: SIMULATION is the default mode, and HYBRID/REAL_AWS require explicit configuration plus REAL_AWS_ALLOWLIST membership. This is a safety feature, but it means out-of-the-box behaviour is simulated until the operator opts in.</w:t>
+      </w:r>
     </w:p>
     <w:p>
       <w:pPr>
@@ -16889,7 +17129,7 @@
         </w:rPr>
         <w:t>Key engineering takeaways realized through this implementation include:</w:t>
         <w:br/>
-        <w:t>• Event Choreography Over Orchestration: Decentralized event routing via Amazon EventBridge eliminates the latency and state overhead of centralized orchestrators (e.g., Step Functions), enabling sub-second reaction times.</w:t>
+        <w:t>• Event Choreography Over Orchestration: Decentralized event routing via Amazon EventBridge removes the latency and state overhead of centralized orchestrators (e.g., Step Functions), keeping the measured detection-to-dispatch path in the low single-digit seconds (3.2–6.8 s).</w:t>
         <w:br/>
         <w:t>• Atomic Concurrency Guards: In distributed cloud systems, mathematical idempotency cannot rely on memory locks; atomic DynamoDB conditional expressions are essential to prevent recovery storms.</w:t>
         <w:br/>
@@ -17304,7 +17544,7 @@
                 <w:color w:val="1F2937"/>
                 <w:sz w:val="15"/>
               </w:rPr>
-              <w:t>Native AWS SDK actuation (Sub-6s MTTR)</w:t>
+              <w:t>Native AWS SDK actuation (3.2–6.8 s to dispatch)</w:t>
             </w:r>
           </w:p>
         </w:tc>
@@ -18041,7 +18281,7 @@
           <w:color w:val="1F2937"/>
           <w:sz w:val="18"/>
         </w:rPr>
-        <w:t>Q5: How does the system achieve an MTTR under 5.8 seconds?</w:t>
+        <w:t>Q5: How fast is the recovery path, and what exactly does that number measure?</w:t>
       </w:r>
     </w:p>
     <w:p>
@@ -18063,7 +18303,7 @@
           <w:color w:val="1F2937"/>
           <w:sz w:val="18"/>
         </w:rPr>
-        <w:t>Traditional monitoring introduces an operational bottleneck: an engineer must acknowledge an alert, log into a VPN, inspect runbooks, and issue manual commands (15–45 minutes). CloudPulse codifies runbooks into AWS Lambda using the Strategy Pattern. The moment EventBridge receives the CloudWatch alarm, RecoveryFunction dispatches the AWS SDK remediation within milliseconds, achieving closed-loop recovery in under 5.8 seconds.</w:t>
+        <w:t>Traditional monitoring introduces an operational bottleneck: an engineer must acknowledge an alert, log into a VPN, inspect runbooks, and issue manual commands (15–45 minutes). CloudPulse codifies runbooks into AWS Lambda using the Strategy Pattern. The moment EventBridge receives the CloudWatch alarm, RecoveryFunction dispatches the AWS SDK remediation within milliseconds. Across the six real remediations the detection-to-dispatch interval was 3.23–6.80 s (mean 4.40 s). That figure ends when the SDK action is dispatched and the incident is closed; it is not a claim that the workload is already healthy, which can take longer for EC2 boot or RDS availability.</w:t>
       </w:r>
     </w:p>
     <w:p>

</xml_diff>